<commit_message>
Update project structure and remove unnecessary files
</commit_message>
<xml_diff>
--- a/Customer_Churn_ML_Eval_and Recommendations.docx
+++ b/Customer_Churn_ML_Eval_and Recommendations.docx
@@ -246,14 +246,11 @@
     </w:p>
     <w:p>
       <w:r>
-        <w:rPr>
-          <w:noProof/>
-        </w:rPr>
         <w:drawing>
-          <wp:inline distT="0" distB="0" distL="0" distR="0" wp14:anchorId="6F99C3E0" wp14:editId="4ED02A32">
-            <wp:extent cx="5569616" cy="2171700"/>
-            <wp:effectExtent l="0" t="0" r="5715" b="0"/>
-            <wp:docPr id="357365199" name="Picture 1" descr="A graph with text on it&#10;&#10;Description automatically generated"/>
+          <wp:inline distT="0" distB="0" distL="0" distR="0" wp14:anchorId="416D45E1" wp14:editId="6C526249">
+            <wp:extent cx="4699000" cy="5511800"/>
+            <wp:effectExtent l="0" t="0" r="0" b="0"/>
+            <wp:docPr id="769510115" name="Picture 1" descr="A screen shot of a graph&#10;&#10;AI-generated content may be incorrect."/>
             <wp:cNvGraphicFramePr>
               <a:graphicFrameLocks xmlns:a="http://schemas.openxmlformats.org/drawingml/2006/main" noChangeAspect="1"/>
             </wp:cNvGraphicFramePr>
@@ -261,7 +258,7 @@
               <a:graphicData uri="http://schemas.openxmlformats.org/drawingml/2006/picture">
                 <pic:pic xmlns:pic="http://schemas.openxmlformats.org/drawingml/2006/picture">
                   <pic:nvPicPr>
-                    <pic:cNvPr id="357365199" name="Picture 1" descr="A graph with text on it&#10;&#10;Description automatically generated"/>
+                    <pic:cNvPr id="769510115" name="Picture 1" descr="A screen shot of a graph&#10;&#10;AI-generated content may be incorrect."/>
                     <pic:cNvPicPr/>
                   </pic:nvPicPr>
                   <pic:blipFill>
@@ -273,7 +270,7 @@
                   <pic:spPr>
                     <a:xfrm>
                       <a:off x="0" y="0"/>
-                      <a:ext cx="5717893" cy="2229516"/>
+                      <a:ext cx="4699000" cy="5511800"/>
                     </a:xfrm>
                     <a:prstGeom prst="rect">
                       <a:avLst/>
@@ -322,6 +319,10 @@
     </w:p>
     <w:p>
       <w:r>
+        <w:rPr>
+          <w:noProof/>
+        </w:rPr>
+        <w:lastRenderedPageBreak/>
         <w:drawing>
           <wp:inline distT="0" distB="0" distL="0" distR="0" wp14:anchorId="62C7E942" wp14:editId="3977C6C8">
             <wp:extent cx="5943600" cy="3722370"/>
@@ -374,64 +375,103 @@
           <w:b/>
           <w:bCs/>
         </w:rPr>
+        <w:t xml:space="preserve">Analysis using </w:t>
+      </w:r>
+      <w:r>
+        <w:rPr>
+          <w:b/>
+          <w:bCs/>
+        </w:rPr>
+        <w:t xml:space="preserve">H2o.Ai </w:t>
+      </w:r>
+      <w:r>
+        <w:rPr>
+          <w:b/>
+          <w:bCs/>
+        </w:rPr>
+        <w:t xml:space="preserve">Stacked Ensemble </w:t>
+      </w:r>
+    </w:p>
+    <w:p>
+      <w:pPr>
+        <w:rPr>
+          <w:b/>
+          <w:bCs/>
+        </w:rPr>
+      </w:pPr>
+    </w:p>
+    <w:p>
+      <w:pPr>
+        <w:rPr>
+          <w:b/>
+          <w:bCs/>
+        </w:rPr>
+      </w:pPr>
+      <w:r>
+        <w:rPr>
+          <w:b/>
+          <w:bCs/>
+        </w:rPr>
+        <w:t>Leaderboard:</w:t>
+      </w:r>
+    </w:p>
+    <w:p>
+      <w:pPr>
+        <w:rPr>
+          <w:b/>
+          <w:bCs/>
+        </w:rPr>
+      </w:pPr>
+    </w:p>
+    <w:p>
+      <w:pPr>
+        <w:rPr>
+          <w:b/>
+          <w:bCs/>
+        </w:rPr>
+      </w:pPr>
+    </w:p>
+    <w:p>
+      <w:pPr>
+        <w:rPr>
+          <w:b/>
+          <w:bCs/>
+        </w:rPr>
+      </w:pPr>
+    </w:p>
+    <w:p>
+      <w:pPr>
+        <w:rPr>
+          <w:b/>
+          <w:bCs/>
+        </w:rPr>
+      </w:pPr>
+      <w:r>
+        <w:rPr>
+          <w:b/>
+          <w:bCs/>
+        </w:rPr>
+        <w:t>Feature importance:</w:t>
+      </w:r>
+    </w:p>
+    <w:p>
+      <w:pPr>
+        <w:rPr>
+          <w:b/>
+          <w:bCs/>
+        </w:rPr>
+      </w:pPr>
+      <w:r>
+        <w:rPr>
+          <w:b/>
+          <w:bCs/>
+        </w:rPr>
         <w:lastRenderedPageBreak/>
-        <w:t xml:space="preserve">Analysis using </w:t>
-      </w:r>
-      <w:r>
-        <w:rPr>
-          <w:b/>
-          <w:bCs/>
-        </w:rPr>
-        <w:t xml:space="preserve">H2o.Ai </w:t>
-      </w:r>
-      <w:r>
-        <w:rPr>
-          <w:b/>
-          <w:bCs/>
-        </w:rPr>
-        <w:t xml:space="preserve">Stacked Ensemble </w:t>
-      </w:r>
-    </w:p>
-    <w:p>
-      <w:pPr>
-        <w:rPr>
-          <w:b/>
-          <w:bCs/>
-        </w:rPr>
-      </w:pPr>
-      <w:r>
-        <w:rPr>
-          <w:b/>
-          <w:bCs/>
-        </w:rPr>
-        <w:t xml:space="preserve">Doc5: </w:t>
-      </w:r>
-      <w:r>
-        <w:rPr>
-          <w:b/>
-          <w:bCs/>
-        </w:rPr>
-        <w:t>Leader Board:</w:t>
-      </w:r>
-    </w:p>
-    <w:p>
-      <w:pPr>
-        <w:rPr>
-          <w:b/>
-          <w:bCs/>
-        </w:rPr>
-      </w:pPr>
-      <w:r>
-        <w:rPr>
-          <w:b/>
-          <w:bCs/>
-          <w:noProof/>
-        </w:rPr>
         <w:drawing>
-          <wp:inline distT="0" distB="0" distL="0" distR="0" wp14:anchorId="63DD2CCF" wp14:editId="4C5072A0">
-            <wp:extent cx="5943600" cy="2589530"/>
-            <wp:effectExtent l="0" t="0" r="0" b="1270"/>
-            <wp:docPr id="518403504" name="Picture 1"/>
+          <wp:inline distT="0" distB="0" distL="0" distR="0" wp14:anchorId="7F6556F2" wp14:editId="3EA97D2B">
+            <wp:extent cx="5943600" cy="1971040"/>
+            <wp:effectExtent l="0" t="0" r="0" b="0"/>
+            <wp:docPr id="1879600651" name="Picture 1" descr="A screenshot of a computer&#10;&#10;AI-generated content may be incorrect."/>
             <wp:cNvGraphicFramePr>
               <a:graphicFrameLocks xmlns:a="http://schemas.openxmlformats.org/drawingml/2006/main" noChangeAspect="1"/>
             </wp:cNvGraphicFramePr>
@@ -439,7 +479,7 @@
               <a:graphicData uri="http://schemas.openxmlformats.org/drawingml/2006/picture">
                 <pic:pic xmlns:pic="http://schemas.openxmlformats.org/drawingml/2006/picture">
                   <pic:nvPicPr>
-                    <pic:cNvPr id="518403504" name=""/>
+                    <pic:cNvPr id="1879600651" name="Picture 1" descr="A screenshot of a computer&#10;&#10;AI-generated content may be incorrect."/>
                     <pic:cNvPicPr/>
                   </pic:nvPicPr>
                   <pic:blipFill>
@@ -451,7 +491,7 @@
                   <pic:spPr>
                     <a:xfrm>
                       <a:off x="0" y="0"/>
-                      <a:ext cx="5943600" cy="2589530"/>
+                      <a:ext cx="5943600" cy="1971040"/>
                     </a:xfrm>
                     <a:prstGeom prst="rect">
                       <a:avLst/>
@@ -471,29 +511,6 @@
           <w:bCs/>
         </w:rPr>
       </w:pPr>
-    </w:p>
-    <w:p>
-      <w:pPr>
-        <w:rPr>
-          <w:b/>
-          <w:bCs/>
-        </w:rPr>
-      </w:pPr>
-      <w:r>
-        <w:rPr>
-          <w:b/>
-          <w:bCs/>
-        </w:rPr>
-        <w:t>Doc6: Model Details</w:t>
-      </w:r>
-    </w:p>
-    <w:p>
-      <w:pPr>
-        <w:rPr>
-          <w:b/>
-          <w:bCs/>
-        </w:rPr>
-      </w:pPr>
       <w:r>
         <w:rPr>
           <w:b/>
@@ -501,10 +518,10 @@
           <w:noProof/>
         </w:rPr>
         <w:drawing>
-          <wp:inline distT="0" distB="0" distL="0" distR="0" wp14:anchorId="70BAF46E" wp14:editId="7D1B67F7">
-            <wp:extent cx="5530850" cy="2875300"/>
-            <wp:effectExtent l="0" t="0" r="0" b="0"/>
-            <wp:docPr id="809103077" name="Picture 1" descr="A screenshot of a computer&#10;&#10;Description automatically generated"/>
+          <wp:inline distT="0" distB="0" distL="0" distR="0" wp14:anchorId="1BD50D06" wp14:editId="606B0E44">
+            <wp:extent cx="5943600" cy="4252595"/>
+            <wp:effectExtent l="0" t="0" r="0" b="1905"/>
+            <wp:docPr id="655660031" name="Picture 1" descr="A screenshot of a computer&#10;&#10;AI-generated content may be incorrect."/>
             <wp:cNvGraphicFramePr>
               <a:graphicFrameLocks xmlns:a="http://schemas.openxmlformats.org/drawingml/2006/main" noChangeAspect="1"/>
             </wp:cNvGraphicFramePr>
@@ -512,7 +529,7 @@
               <a:graphicData uri="http://schemas.openxmlformats.org/drawingml/2006/picture">
                 <pic:pic xmlns:pic="http://schemas.openxmlformats.org/drawingml/2006/picture">
                   <pic:nvPicPr>
-                    <pic:cNvPr id="809103077" name="Picture 1" descr="A screenshot of a computer&#10;&#10;Description automatically generated"/>
+                    <pic:cNvPr id="655660031" name="Picture 1" descr="A screenshot of a computer&#10;&#10;AI-generated content may be incorrect."/>
                     <pic:cNvPicPr/>
                   </pic:nvPicPr>
                   <pic:blipFill>
@@ -524,7 +541,7 @@
                   <pic:spPr>
                     <a:xfrm>
                       <a:off x="0" y="0"/>
-                      <a:ext cx="5576456" cy="2899009"/>
+                      <a:ext cx="5943600" cy="4252595"/>
                     </a:xfrm>
                     <a:prstGeom prst="rect">
                       <a:avLst/>
@@ -544,79 +561,18 @@
           <w:bCs/>
         </w:rPr>
       </w:pPr>
-    </w:p>
-    <w:p>
-      <w:pPr>
-        <w:rPr>
-          <w:b/>
-          <w:bCs/>
-        </w:rPr>
-      </w:pPr>
-    </w:p>
-    <w:p>
-      <w:pPr>
-        <w:rPr>
-          <w:b/>
-          <w:bCs/>
-        </w:rPr>
-      </w:pPr>
-    </w:p>
-    <w:p>
-      <w:pPr>
-        <w:rPr>
-          <w:b/>
-          <w:bCs/>
-        </w:rPr>
-      </w:pPr>
-    </w:p>
-    <w:p>
-      <w:pPr>
-        <w:rPr>
-          <w:b/>
-          <w:bCs/>
-        </w:rPr>
-      </w:pPr>
-      <w:r>
-        <w:rPr>
-          <w:b/>
-          <w:bCs/>
+      <w:r>
+        <w:rPr>
+          <w:b/>
+          <w:bCs/>
+          <w:noProof/>
         </w:rPr>
         <w:lastRenderedPageBreak/>
-        <w:t xml:space="preserve">Doc 7: Model </w:t>
-      </w:r>
-      <w:r>
-        <w:rPr>
-          <w:b/>
-          <w:bCs/>
-        </w:rPr>
-        <w:t>Summary of Evaluation</w:t>
-      </w:r>
-      <w:r>
-        <w:rPr>
-          <w:b/>
-          <w:bCs/>
-        </w:rPr>
-        <w:t>:</w:t>
-      </w:r>
-    </w:p>
-    <w:p>
-      <w:pPr>
-        <w:rPr>
-          <w:b/>
-          <w:bCs/>
-        </w:rPr>
-      </w:pPr>
-      <w:r>
-        <w:rPr>
-          <w:b/>
-          <w:bCs/>
-          <w:noProof/>
-        </w:rPr>
         <w:drawing>
-          <wp:inline distT="0" distB="0" distL="0" distR="0" wp14:anchorId="5F4B9304" wp14:editId="278544C1">
-            <wp:extent cx="5943600" cy="1981200"/>
-            <wp:effectExtent l="0" t="0" r="0" b="0"/>
-            <wp:docPr id="1062792827" name="Picture 1" descr="A computer screen with numbers and symbols&#10;&#10;Description automatically generated"/>
+          <wp:inline distT="0" distB="0" distL="0" distR="0" wp14:anchorId="5B5DB210" wp14:editId="0EF56E85">
+            <wp:extent cx="5943600" cy="5673725"/>
+            <wp:effectExtent l="0" t="0" r="0" b="3175"/>
+            <wp:docPr id="1026386651" name="Picture 1" descr="A graph of a number of different colored bars&#10;&#10;AI-generated content may be incorrect."/>
             <wp:cNvGraphicFramePr>
               <a:graphicFrameLocks xmlns:a="http://schemas.openxmlformats.org/drawingml/2006/main" noChangeAspect="1"/>
             </wp:cNvGraphicFramePr>
@@ -624,7 +580,7 @@
               <a:graphicData uri="http://schemas.openxmlformats.org/drawingml/2006/picture">
                 <pic:pic xmlns:pic="http://schemas.openxmlformats.org/drawingml/2006/picture">
                   <pic:nvPicPr>
-                    <pic:cNvPr id="1062792827" name="Picture 1" descr="A computer screen with numbers and symbols&#10;&#10;Description automatically generated"/>
+                    <pic:cNvPr id="1026386651" name="Picture 1" descr="A graph of a number of different colored bars&#10;&#10;AI-generated content may be incorrect."/>
                     <pic:cNvPicPr/>
                   </pic:nvPicPr>
                   <pic:blipFill>
@@ -636,7 +592,7 @@
                   <pic:spPr>
                     <a:xfrm>
                       <a:off x="0" y="0"/>
-                      <a:ext cx="5943600" cy="1981200"/>
+                      <a:ext cx="5943600" cy="5673725"/>
                     </a:xfrm>
                     <a:prstGeom prst="rect">
                       <a:avLst/>
@@ -664,12 +620,90 @@
           <w:bCs/>
         </w:rPr>
       </w:pPr>
-      <w:r>
-        <w:rPr>
-          <w:b/>
-          <w:bCs/>
-        </w:rPr>
-        <w:t xml:space="preserve">Doc 8_ </w:t>
+    </w:p>
+    <w:p>
+      <w:pPr>
+        <w:rPr>
+          <w:b/>
+          <w:bCs/>
+        </w:rPr>
+      </w:pPr>
+      <w:r>
+        <w:rPr>
+          <w:b/>
+          <w:bCs/>
+        </w:rPr>
+        <w:t>Doc6: Model Details</w:t>
+      </w:r>
+    </w:p>
+    <w:p>
+      <w:pPr>
+        <w:rPr>
+          <w:b/>
+          <w:bCs/>
+        </w:rPr>
+      </w:pPr>
+    </w:p>
+    <w:p>
+      <w:pPr>
+        <w:rPr>
+          <w:b/>
+          <w:bCs/>
+        </w:rPr>
+      </w:pPr>
+    </w:p>
+    <w:p>
+      <w:pPr>
+        <w:rPr>
+          <w:b/>
+          <w:bCs/>
+        </w:rPr>
+      </w:pPr>
+    </w:p>
+    <w:p>
+      <w:pPr>
+        <w:rPr>
+          <w:b/>
+          <w:bCs/>
+        </w:rPr>
+      </w:pPr>
+    </w:p>
+    <w:p>
+      <w:pPr>
+        <w:rPr>
+          <w:b/>
+          <w:bCs/>
+        </w:rPr>
+      </w:pPr>
+    </w:p>
+    <w:p>
+      <w:pPr>
+        <w:rPr>
+          <w:b/>
+          <w:bCs/>
+        </w:rPr>
+      </w:pPr>
+      <w:r>
+        <w:rPr>
+          <w:b/>
+          <w:bCs/>
+        </w:rPr>
+        <w:lastRenderedPageBreak/>
+        <w:t xml:space="preserve">Doc 7: Model </w:t>
+      </w:r>
+      <w:r>
+        <w:rPr>
+          <w:b/>
+          <w:bCs/>
+        </w:rPr>
+        <w:t>Summary of Evaluation</w:t>
+      </w:r>
+      <w:r>
+        <w:rPr>
+          <w:b/>
+          <w:bCs/>
+        </w:rPr>
+        <w:t xml:space="preserve"> and confusion matrix</w:t>
       </w:r>
     </w:p>
     <w:p>
@@ -686,10 +720,10 @@
           <w:noProof/>
         </w:rPr>
         <w:drawing>
-          <wp:inline distT="0" distB="0" distL="0" distR="0" wp14:anchorId="227FF476" wp14:editId="77133C42">
-            <wp:extent cx="5943600" cy="4965065"/>
+          <wp:inline distT="0" distB="0" distL="0" distR="0" wp14:anchorId="16ECC09F" wp14:editId="08363CE9">
+            <wp:extent cx="5943600" cy="4380865"/>
             <wp:effectExtent l="0" t="0" r="0" b="635"/>
-            <wp:docPr id="879574189" name="Picture 1" descr="A black screen with white text&#10;&#10;Description automatically generated"/>
+            <wp:docPr id="1600288163" name="Picture 1" descr="A computer screen shot of a black screen&#10;&#10;AI-generated content may be incorrect."/>
             <wp:cNvGraphicFramePr>
               <a:graphicFrameLocks xmlns:a="http://schemas.openxmlformats.org/drawingml/2006/main" noChangeAspect="1"/>
             </wp:cNvGraphicFramePr>
@@ -697,7 +731,7 @@
               <a:graphicData uri="http://schemas.openxmlformats.org/drawingml/2006/picture">
                 <pic:pic xmlns:pic="http://schemas.openxmlformats.org/drawingml/2006/picture">
                   <pic:nvPicPr>
-                    <pic:cNvPr id="879574189" name="Picture 1" descr="A black screen with white text&#10;&#10;Description automatically generated"/>
+                    <pic:cNvPr id="1600288163" name="Picture 1" descr="A computer screen shot of a black screen&#10;&#10;AI-generated content may be incorrect."/>
                     <pic:cNvPicPr/>
                   </pic:nvPicPr>
                   <pic:blipFill>
@@ -709,7 +743,7 @@
                   <pic:spPr>
                     <a:xfrm>
                       <a:off x="0" y="0"/>
-                      <a:ext cx="5943600" cy="4965065"/>
+                      <a:ext cx="5943600" cy="4380865"/>
                     </a:xfrm>
                     <a:prstGeom prst="rect">
                       <a:avLst/>
@@ -737,12 +771,20 @@
           <w:bCs/>
         </w:rPr>
       </w:pPr>
-      <w:r>
-        <w:rPr>
-          <w:b/>
-          <w:bCs/>
-        </w:rPr>
-        <w:t>Confusion Matrix:</w:t>
+    </w:p>
+    <w:p>
+      <w:pPr>
+        <w:rPr>
+          <w:b/>
+          <w:bCs/>
+        </w:rPr>
+      </w:pPr>
+      <w:r>
+        <w:rPr>
+          <w:b/>
+          <w:bCs/>
+        </w:rPr>
+        <w:t>ROC</w:t>
       </w:r>
     </w:p>
     <w:p>
@@ -758,11 +800,12 @@
           <w:bCs/>
           <w:noProof/>
         </w:rPr>
+        <w:lastRenderedPageBreak/>
         <w:drawing>
-          <wp:inline distT="0" distB="0" distL="0" distR="0" wp14:anchorId="6B02571D" wp14:editId="30461424">
-            <wp:extent cx="5943600" cy="1548765"/>
+          <wp:inline distT="0" distB="0" distL="0" distR="0" wp14:anchorId="5C088B04" wp14:editId="3804F76B">
+            <wp:extent cx="5943600" cy="4380865"/>
             <wp:effectExtent l="0" t="0" r="0" b="635"/>
-            <wp:docPr id="1854463228" name="Picture 1"/>
+            <wp:docPr id="473658913" name="Picture 1" descr="A graph with a blue line&#10;&#10;AI-generated content may be incorrect."/>
             <wp:cNvGraphicFramePr>
               <a:graphicFrameLocks xmlns:a="http://schemas.openxmlformats.org/drawingml/2006/main" noChangeAspect="1"/>
             </wp:cNvGraphicFramePr>
@@ -770,7 +813,7 @@
               <a:graphicData uri="http://schemas.openxmlformats.org/drawingml/2006/picture">
                 <pic:pic xmlns:pic="http://schemas.openxmlformats.org/drawingml/2006/picture">
                   <pic:nvPicPr>
-                    <pic:cNvPr id="1854463228" name=""/>
+                    <pic:cNvPr id="473658913" name="Picture 1" descr="A graph with a blue line&#10;&#10;AI-generated content may be incorrect."/>
                     <pic:cNvPicPr/>
                   </pic:nvPicPr>
                   <pic:blipFill>
@@ -782,7 +825,7 @@
                   <pic:spPr>
                     <a:xfrm>
                       <a:off x="0" y="0"/>
-                      <a:ext cx="5943600" cy="1548765"/>
+                      <a:ext cx="5943600" cy="4380865"/>
                     </a:xfrm>
                     <a:prstGeom prst="rect">
                       <a:avLst/>
@@ -818,12 +861,28 @@
           <w:bCs/>
         </w:rPr>
       </w:pPr>
-      <w:r>
-        <w:rPr>
-          <w:b/>
-          <w:bCs/>
-        </w:rPr>
-        <w:t>ROC</w:t>
+    </w:p>
+    <w:p>
+      <w:pPr>
+        <w:rPr>
+          <w:b/>
+          <w:bCs/>
+        </w:rPr>
+      </w:pPr>
+    </w:p>
+    <w:p>
+      <w:pPr>
+        <w:rPr>
+          <w:b/>
+          <w:bCs/>
+        </w:rPr>
+      </w:pPr>
+      <w:r>
+        <w:rPr>
+          <w:b/>
+          <w:bCs/>
+        </w:rPr>
+        <w:t>AUC-PR</w:t>
       </w:r>
     </w:p>
     <w:p>
@@ -839,11 +898,12 @@
           <w:bCs/>
           <w:noProof/>
         </w:rPr>
+        <w:lastRenderedPageBreak/>
         <w:drawing>
-          <wp:inline distT="0" distB="0" distL="0" distR="0" wp14:anchorId="1EAB7C8E" wp14:editId="215E2791">
-            <wp:extent cx="5943600" cy="4324985"/>
-            <wp:effectExtent l="0" t="0" r="0" b="5715"/>
-            <wp:docPr id="1218301517" name="Picture 1" descr="A graph of a function&#10;&#10;Description automatically generated"/>
+          <wp:inline distT="0" distB="0" distL="0" distR="0" wp14:anchorId="0A5AB045" wp14:editId="60676D54">
+            <wp:extent cx="5943600" cy="4380865"/>
+            <wp:effectExtent l="0" t="0" r="0" b="635"/>
+            <wp:docPr id="1440478920" name="Picture 1" descr="A graph of a graph&#10;&#10;AI-generated content may be incorrect."/>
             <wp:cNvGraphicFramePr>
               <a:graphicFrameLocks xmlns:a="http://schemas.openxmlformats.org/drawingml/2006/main" noChangeAspect="1"/>
             </wp:cNvGraphicFramePr>
@@ -851,7 +911,7 @@
               <a:graphicData uri="http://schemas.openxmlformats.org/drawingml/2006/picture">
                 <pic:pic xmlns:pic="http://schemas.openxmlformats.org/drawingml/2006/picture">
                   <pic:nvPicPr>
-                    <pic:cNvPr id="1218301517" name="Picture 1" descr="A graph of a function&#10;&#10;Description automatically generated"/>
+                    <pic:cNvPr id="1440478920" name="Picture 1" descr="A graph of a graph&#10;&#10;AI-generated content may be incorrect."/>
                     <pic:cNvPicPr/>
                   </pic:nvPicPr>
                   <pic:blipFill>
@@ -863,7 +923,7 @@
                   <pic:spPr>
                     <a:xfrm>
                       <a:off x="0" y="0"/>
-                      <a:ext cx="5943600" cy="4324985"/>
+                      <a:ext cx="5943600" cy="4380865"/>
                     </a:xfrm>
                     <a:prstGeom prst="rect">
                       <a:avLst/>
@@ -905,11 +965,12 @@
           <w:bCs/>
           <w:noProof/>
         </w:rPr>
+        <w:lastRenderedPageBreak/>
         <w:drawing>
-          <wp:inline distT="0" distB="0" distL="0" distR="0" wp14:anchorId="7A3A5EEB" wp14:editId="2D5BF6A3">
-            <wp:extent cx="5942662" cy="3180806"/>
-            <wp:effectExtent l="0" t="0" r="1270" b="0"/>
-            <wp:docPr id="1274294620" name="Picture 1" descr="A graph of a graph&#10;&#10;Description automatically generated"/>
+          <wp:inline distT="0" distB="0" distL="0" distR="0" wp14:anchorId="5387667B" wp14:editId="28A71F49">
+            <wp:extent cx="5943600" cy="5913755"/>
+            <wp:effectExtent l="0" t="0" r="0" b="4445"/>
+            <wp:docPr id="1049109010" name="Picture 1" descr="A graph with a line&#10;&#10;AI-generated content may be incorrect."/>
             <wp:cNvGraphicFramePr>
               <a:graphicFrameLocks xmlns:a="http://schemas.openxmlformats.org/drawingml/2006/main" noChangeAspect="1"/>
             </wp:cNvGraphicFramePr>
@@ -917,7 +978,7 @@
               <a:graphicData uri="http://schemas.openxmlformats.org/drawingml/2006/picture">
                 <pic:pic xmlns:pic="http://schemas.openxmlformats.org/drawingml/2006/picture">
                   <pic:nvPicPr>
-                    <pic:cNvPr id="1274294620" name="Picture 1" descr="A graph of a graph&#10;&#10;Description automatically generated"/>
+                    <pic:cNvPr id="1049109010" name="Picture 1" descr="A graph with a line&#10;&#10;AI-generated content may be incorrect."/>
                     <pic:cNvPicPr/>
                   </pic:nvPicPr>
                   <pic:blipFill>
@@ -929,7 +990,7 @@
                   <pic:spPr>
                     <a:xfrm>
                       <a:off x="0" y="0"/>
-                      <a:ext cx="5954766" cy="3187284"/>
+                      <a:ext cx="5943600" cy="5913755"/>
                     </a:xfrm>
                     <a:prstGeom prst="rect">
                       <a:avLst/>
@@ -957,6 +1018,64 @@
           <w:bCs/>
         </w:rPr>
       </w:pPr>
+    </w:p>
+    <w:p>
+      <w:pPr>
+        <w:rPr>
+          <w:b/>
+          <w:bCs/>
+        </w:rPr>
+      </w:pPr>
+    </w:p>
+    <w:p>
+      <w:pPr>
+        <w:rPr>
+          <w:b/>
+          <w:bCs/>
+        </w:rPr>
+      </w:pPr>
+      <w:r>
+        <w:rPr>
+          <w:b/>
+          <w:bCs/>
+        </w:rPr>
+        <w:lastRenderedPageBreak/>
+        <w:drawing>
+          <wp:inline distT="0" distB="0" distL="0" distR="0" wp14:anchorId="591BC5A7" wp14:editId="20FF3C72">
+            <wp:extent cx="5943600" cy="1408430"/>
+            <wp:effectExtent l="0" t="0" r="0" b="1270"/>
+            <wp:docPr id="1764532910" name="Picture 1" descr="A black rectangle with white text&#10;&#10;AI-generated content may be incorrect."/>
+            <wp:cNvGraphicFramePr>
+              <a:graphicFrameLocks xmlns:a="http://schemas.openxmlformats.org/drawingml/2006/main" noChangeAspect="1"/>
+            </wp:cNvGraphicFramePr>
+            <a:graphic xmlns:a="http://schemas.openxmlformats.org/drawingml/2006/main">
+              <a:graphicData uri="http://schemas.openxmlformats.org/drawingml/2006/picture">
+                <pic:pic xmlns:pic="http://schemas.openxmlformats.org/drawingml/2006/picture">
+                  <pic:nvPicPr>
+                    <pic:cNvPr id="1764532910" name="Picture 1" descr="A black rectangle with white text&#10;&#10;AI-generated content may be incorrect."/>
+                    <pic:cNvPicPr/>
+                  </pic:nvPicPr>
+                  <pic:blipFill>
+                    <a:blip r:embed="rId15"/>
+                    <a:stretch>
+                      <a:fillRect/>
+                    </a:stretch>
+                  </pic:blipFill>
+                  <pic:spPr>
+                    <a:xfrm>
+                      <a:off x="0" y="0"/>
+                      <a:ext cx="5943600" cy="1408430"/>
+                    </a:xfrm>
+                    <a:prstGeom prst="rect">
+                      <a:avLst/>
+                    </a:prstGeom>
+                  </pic:spPr>
+                </pic:pic>
+              </a:graphicData>
+            </a:graphic>
+          </wp:inline>
+        </w:drawing>
+      </w:r>
     </w:p>
     <w:p/>
     <w:p/>

</xml_diff>